<commit_message>
feat: implement dynamic sequential numbering and conditional section headers in Notulen generator
</commit_message>
<xml_diff>
--- a/src/resources/templates/kepegawaian/notulen.docx
+++ b/src/resources/templates/kepegawaian/notulen.docx
@@ -340,7 +340,7 @@
           <w:sz w:val="22"/>
           <w:szCs w:val="22"/>
         </w:rPr>
-        <w:t>Dasar</w:t>
+        <w:t>${dasar_hdr}</w:t>
       </w:r>
     </w:p>
     <w:p>
@@ -362,6 +362,7 @@
     <w:p>
       <w:pPr>
         <w:spacing w:line="360" w:lineRule="auto"/>
+        <w:ind w:left="720" w:hanging="360"/>
         <w:jc w:val="both"/>
         <w:rPr>
           <w:rFonts w:ascii="Arial" w:hAnsi="Arial" w:cs="Arial"/>
@@ -410,7 +411,7 @@
           <w:sz w:val="22"/>
           <w:szCs w:val="22"/>
         </w:rPr>
-        <w:t>Waktu dan Tempat Pelaksanaan</w:t>
+        <w:t>${waktu_hdr}</w:t>
       </w:r>
     </w:p>
     <w:tbl>
@@ -659,7 +660,7 @@
           <w:sz w:val="22"/>
           <w:szCs w:val="22"/>
         </w:rPr>
-        <w:t>Narasumber :</w:t>
+        <w:t>${narasumber_hdr}</w:t>
       </w:r>
     </w:p>
     <w:p>
@@ -676,6 +677,85 @@
       </w:pPr>
       <w:r>
         <w:t>${narasumber_block}</w:t>
+      </w:r>
+    </w:p>
+    <w:p>
+      <w:pPr>
+        <w:spacing w:line="360" w:lineRule="auto"/>
+        <w:ind w:left="720" w:hanging="360"/>
+        <w:jc w:val="both"/>
+        <w:rPr>
+          <w:rFonts w:ascii="Arial" w:hAnsi="Arial" w:cs="Arial"/>
+          <w:sz w:val="22"/>
+          <w:szCs w:val="22"/>
+        </w:rPr>
+      </w:pPr>
+      <w:r>
+        <w:rPr>
+          <w:rFonts w:ascii="Arial" w:hAnsi="Arial" w:cs="Arial"/>
+          <w:sz w:val="22"/>
+          <w:szCs w:val="22"/>
+        </w:rPr>
+        <w:t>${narasumber_item}</w:t>
+      </w:r>
+    </w:p>
+    <w:p>
+      <w:pPr>
+        <w:spacing w:line="360" w:lineRule="auto"/>
+      </w:pPr>
+      <w:r>
+        <w:t>${/narasumber_block}</w:t>
+      </w:r>
+    </w:p>
+    <w:p>
+      <w:pPr>
+        <w:spacing w:line="240" w:lineRule="auto"/>
+      </w:pPr>
+    </w:p>
+    <w:p>
+      <w:pPr>
+        <w:spacing w:line="360" w:lineRule="auto"/>
+      </w:pPr>
+      <w:r>
+        <w:t>${peserta_hdr_block}</w:t>
+      </w:r>
+    </w:p>
+    <w:p>
+      <w:pPr>
+        <w:spacing w:before="120" w:after="60" w:line="360" w:lineRule="auto"/>
+        <w:rPr>
+          <w:rFonts w:ascii="Arial" w:hAnsi="Arial" w:cs="Arial"/>
+          <w:b/>
+          <w:bCs/>
+          <w:sz w:val="22"/>
+          <w:szCs w:val="22"/>
+        </w:rPr>
+      </w:pPr>
+      <w:r>
+        <w:rPr>
+          <w:rFonts w:ascii="Arial" w:hAnsi="Arial" w:cs="Arial"/>
+          <w:b/>
+          <w:bCs/>
+          <w:sz w:val="22"/>
+          <w:szCs w:val="22"/>
+        </w:rPr>
+        <w:t>${peserta_hdr}</w:t>
+      </w:r>
+    </w:p>
+    <w:p>
+      <w:pPr>
+        <w:spacing w:line="360" w:lineRule="auto"/>
+      </w:pPr>
+      <w:r>
+        <w:t>${/peserta_hdr_block}</w:t>
+      </w:r>
+    </w:p>
+    <w:p>
+      <w:pPr>
+        <w:spacing w:line="360" w:lineRule="auto"/>
+      </w:pPr>
+      <w:r>
+        <w:t>${peserta_deskripsi_block}</w:t>
       </w:r>
     </w:p>
     <w:p>
@@ -694,7 +774,7 @@
           <w:sz w:val="22"/>
           <w:szCs w:val="22"/>
         </w:rPr>
-        <w:t>${narasumber_item}</w:t>
+        <w:t>${peserta_deskripsi}</w:t>
       </w:r>
     </w:p>
     <w:p>
@@ -702,21 +782,49 @@
         <w:spacing w:line="360" w:lineRule="auto"/>
       </w:pPr>
       <w:r>
-        <w:t>${/narasumber_block}</w:t>
+        <w:t>${/peserta_deskripsi_block}</w:t>
+      </w:r>
+    </w:p>
+    <w:p>
+      <w:pPr>
+        <w:spacing w:line="360" w:lineRule="auto"/>
+      </w:pPr>
+      <w:r>
+        <w:t>${peserta_daftar_block}</w:t>
+      </w:r>
+    </w:p>
+    <w:p>
+      <w:pPr>
+        <w:spacing w:line="360" w:lineRule="auto"/>
+        <w:ind w:left="720" w:hanging="360"/>
+        <w:jc w:val="both"/>
+        <w:rPr>
+          <w:rFonts w:ascii="Arial" w:hAnsi="Arial" w:cs="Arial"/>
+          <w:sz w:val="22"/>
+          <w:szCs w:val="22"/>
+        </w:rPr>
+      </w:pPr>
+      <w:r>
+        <w:rPr>
+          <w:rFonts w:ascii="Arial" w:hAnsi="Arial" w:cs="Arial"/>
+          <w:sz w:val="22"/>
+          <w:szCs w:val="22"/>
+        </w:rPr>
+        <w:t>${peserta_item}</w:t>
+      </w:r>
+    </w:p>
+    <w:p>
+      <w:pPr>
+        <w:spacing w:line="360" w:lineRule="auto"/>
+      </w:pPr>
+      <w:r>
+        <w:t>${/peserta_daftar_block}</w:t>
       </w:r>
     </w:p>
     <w:p>
       <w:pPr>
         <w:spacing w:line="240" w:lineRule="auto"/>
       </w:pPr>
-    </w:p>
-    <w:p>
-      <w:pPr>
-        <w:spacing w:line="360" w:lineRule="auto"/>
-      </w:pPr>
-      <w:r>
-        <w:t>${peserta_hdr_block}</w:t>
-      </w:r>
     </w:p>
     <w:p>
       <w:pPr>
@@ -737,112 +845,7 @@
           <w:sz w:val="22"/>
           <w:szCs w:val="22"/>
         </w:rPr>
-        <w:t>Peserta :</w:t>
-      </w:r>
-    </w:p>
-    <w:p>
-      <w:pPr>
-        <w:spacing w:line="360" w:lineRule="auto"/>
-      </w:pPr>
-      <w:r>
-        <w:t>${/peserta_hdr_block}</w:t>
-      </w:r>
-    </w:p>
-    <w:p>
-      <w:pPr>
-        <w:spacing w:line="360" w:lineRule="auto"/>
-      </w:pPr>
-      <w:r>
-        <w:t>${peserta_deskripsi_block}</w:t>
-      </w:r>
-    </w:p>
-    <w:p>
-      <w:pPr>
-        <w:spacing w:line="360" w:lineRule="auto"/>
-        <w:jc w:val="both"/>
-        <w:rPr>
-          <w:rFonts w:ascii="Arial" w:hAnsi="Arial" w:cs="Arial"/>
-          <w:sz w:val="22"/>
-          <w:szCs w:val="22"/>
-        </w:rPr>
-      </w:pPr>
-      <w:r>
-        <w:rPr>
-          <w:rFonts w:ascii="Arial" w:hAnsi="Arial" w:cs="Arial"/>
-          <w:sz w:val="22"/>
-          <w:szCs w:val="22"/>
-        </w:rPr>
-        <w:t>${peserta_deskripsi}</w:t>
-      </w:r>
-    </w:p>
-    <w:p>
-      <w:pPr>
-        <w:spacing w:line="360" w:lineRule="auto"/>
-      </w:pPr>
-      <w:r>
-        <w:t>${/peserta_deskripsi_block}</w:t>
-      </w:r>
-    </w:p>
-    <w:p>
-      <w:pPr>
-        <w:spacing w:line="360" w:lineRule="auto"/>
-      </w:pPr>
-      <w:r>
-        <w:t>${peserta_daftar_block}</w:t>
-      </w:r>
-    </w:p>
-    <w:p>
-      <w:pPr>
-        <w:spacing w:line="360" w:lineRule="auto"/>
-        <w:jc w:val="both"/>
-        <w:rPr>
-          <w:rFonts w:ascii="Arial" w:hAnsi="Arial" w:cs="Arial"/>
-          <w:sz w:val="22"/>
-          <w:szCs w:val="22"/>
-        </w:rPr>
-      </w:pPr>
-      <w:r>
-        <w:rPr>
-          <w:rFonts w:ascii="Arial" w:hAnsi="Arial" w:cs="Arial"/>
-          <w:sz w:val="22"/>
-          <w:szCs w:val="22"/>
-        </w:rPr>
-        <w:t>${peserta_item}</w:t>
-      </w:r>
-    </w:p>
-    <w:p>
-      <w:pPr>
-        <w:spacing w:line="360" w:lineRule="auto"/>
-      </w:pPr>
-      <w:r>
-        <w:t>${/peserta_daftar_block}</w:t>
-      </w:r>
-    </w:p>
-    <w:p>
-      <w:pPr>
-        <w:spacing w:line="240" w:lineRule="auto"/>
-      </w:pPr>
-    </w:p>
-    <w:p>
-      <w:pPr>
-        <w:spacing w:before="120" w:after="60" w:line="360" w:lineRule="auto"/>
-        <w:rPr>
-          <w:rFonts w:ascii="Arial" w:hAnsi="Arial" w:cs="Arial"/>
-          <w:b/>
-          <w:bCs/>
-          <w:sz w:val="22"/>
-          <w:szCs w:val="22"/>
-        </w:rPr>
-      </w:pPr>
-      <w:r>
-        <w:rPr>
-          <w:rFonts w:ascii="Arial" w:hAnsi="Arial" w:cs="Arial"/>
-          <w:b/>
-          <w:bCs/>
-          <w:sz w:val="22"/>
-          <w:szCs w:val="22"/>
-        </w:rPr>
-        <w:t>Hasil Acara :</w:t>
+        <w:t>${hasil_hdr}</w:t>
       </w:r>
     </w:p>
     <w:p>

</xml_diff>

<commit_message>
Implement code changes to enhance functionality and improve performance across various modules.
</commit_message>
<xml_diff>
--- a/src/resources/templates/kepegawaian/notulen.docx
+++ b/src/resources/templates/kepegawaian/notulen.docx
@@ -10,7 +10,7 @@
         <w:tblBorders>
           <w:top w:val="none" w:sz="0" w:space="0" w:color="auto"/>
           <w:left w:val="none" w:sz="0" w:space="0" w:color="auto"/>
-          <w:bottom w:val="thinThickSmallGap" w:sz="24" w:space="0" w:color="auto"/>
+          <w:bottom w:val="single" w:sz="24" w:space="0" w:color="auto"/>
           <w:right w:val="none" w:sz="0" w:space="0" w:color="auto"/>
           <w:insideH w:val="none" w:sz="0" w:space="0" w:color="auto"/>
           <w:insideV w:val="none" w:sz="0" w:space="0" w:color="auto"/>
@@ -282,11 +282,6 @@
     </w:tbl>
     <w:p>
       <w:pPr>
-        <w:spacing w:line="240" w:lineRule="auto"/>
-      </w:pPr>
-    </w:p>
-    <w:p>
-      <w:pPr>
         <w:spacing w:before="120" w:after="180" w:line="360" w:lineRule="auto"/>
         <w:jc w:val="center"/>
         <w:rPr>
@@ -310,7 +305,7 @@
     </w:p>
     <w:p>
       <w:pPr>
-        <w:spacing w:line="240" w:lineRule="auto"/>
+        <w:spacing w:before="0" w:after="0" w:line="240" w:lineRule="exact"/>
       </w:pPr>
     </w:p>
     <w:p>
@@ -389,7 +384,7 @@
     </w:p>
     <w:p>
       <w:pPr>
-        <w:spacing w:line="240" w:lineRule="auto"/>
+        <w:spacing w:before="0" w:after="0" w:line="240" w:lineRule="exact"/>
       </w:pPr>
     </w:p>
     <w:p>
@@ -630,7 +625,7 @@
     </w:tbl>
     <w:p>
       <w:pPr>
-        <w:spacing w:line="240" w:lineRule="auto"/>
+        <w:spacing w:before="0" w:after="0" w:line="240" w:lineRule="exact"/>
       </w:pPr>
     </w:p>
     <w:p>
@@ -709,7 +704,7 @@
     </w:p>
     <w:p>
       <w:pPr>
-        <w:spacing w:line="240" w:lineRule="auto"/>
+        <w:spacing w:before="0" w:after="0" w:line="240" w:lineRule="exact"/>
       </w:pPr>
     </w:p>
     <w:p>
@@ -823,7 +818,7 @@
     </w:p>
     <w:p>
       <w:pPr>
-        <w:spacing w:line="240" w:lineRule="auto"/>
+        <w:spacing w:before="0" w:after="0" w:line="240" w:lineRule="exact"/>
       </w:pPr>
     </w:p>
     <w:p>
@@ -885,7 +880,7 @@
     </w:p>
     <w:p>
       <w:pPr>
-        <w:spacing w:line="240" w:lineRule="auto"/>
+        <w:spacing w:before="0" w:after="0" w:line="240" w:lineRule="exact"/>
       </w:pPr>
     </w:p>
     <w:p>
@@ -909,7 +904,7 @@
     </w:p>
     <w:p>
       <w:pPr>
-        <w:spacing w:line="240" w:lineRule="auto"/>
+        <w:spacing w:before="0" w:after="0" w:line="240" w:lineRule="exact"/>
       </w:pPr>
     </w:p>
     <w:p>
@@ -961,14 +956,16 @@
               <w:rPr>
                 <w:rFonts w:ascii="Arial" w:hAnsi="Arial" w:cs="Arial"/>
                 <w:sz w:val="22"/>
-              </w:rPr>
-            </w:pPr>
-            <w:r>
-              <w:rPr>
-                <w:rFonts w:ascii="Arial" w:hAnsi="Arial" w:cs="Arial"/>
-                <w:sz w:val="22"/>
-              </w:rPr>
-              <w:t>Mengetahui,</w:t>
+                <w:szCs w:val="22"/>
+              </w:rPr>
+            </w:pPr>
+            <w:r>
+              <w:rPr>
+                <w:rFonts w:ascii="Arial" w:hAnsi="Arial" w:cs="Arial"/>
+                <w:sz w:val="22"/>
+                <w:szCs w:val="22"/>
+              </w:rPr>
+              <w:t xml:space="preserve">Mengetahui,</w:t>
             </w:r>
           </w:p>
           <w:p>
@@ -978,72 +975,16 @@
               <w:rPr>
                 <w:rFonts w:ascii="Arial" w:hAnsi="Arial" w:cs="Arial"/>
                 <w:sz w:val="22"/>
-              </w:rPr>
-            </w:pPr>
-            <w:r>
-              <w:rPr>
-                <w:rFonts w:ascii="Arial" w:hAnsi="Arial" w:cs="Arial"/>
-                <w:sz w:val="22"/>
-              </w:rPr>
-              <w:t>${atasan_jabatan}</w:t>
-            </w:r>
-          </w:p>
-          <w:p>
-            <w:pPr>
-              <w:spacing w:line="360" w:lineRule="auto"/>
-              <w:jc w:val="center"/>
-            </w:pPr>
-          </w:p>
-          <w:p>
-            <w:pPr>
-              <w:spacing w:line="360" w:lineRule="auto"/>
-              <w:jc w:val="center"/>
-            </w:pPr>
-          </w:p>
-          <w:p>
-            <w:pPr>
-              <w:spacing w:line="360" w:lineRule="auto"/>
-              <w:jc w:val="center"/>
-              <w:rPr>
-                <w:rFonts w:ascii="Arial" w:hAnsi="Arial" w:cs="Arial"/>
-                <w:b/>
-                <w:bCs/>
-                <w:sz w:val="22"/>
                 <w:szCs w:val="22"/>
               </w:rPr>
             </w:pPr>
             <w:r>
               <w:rPr>
                 <w:rFonts w:ascii="Arial" w:hAnsi="Arial" w:cs="Arial"/>
-                <w:b/>
-                <w:bCs/>
                 <w:sz w:val="22"/>
                 <w:szCs w:val="22"/>
               </w:rPr>
-              <w:t>${atasan_nama}</w:t>
-            </w:r>
-          </w:p>
-          <w:p>
-            <w:pPr>
-              <w:spacing w:line="360" w:lineRule="auto"/>
-              <w:jc w:val="center"/>
-              <w:rPr>
-                <w:rFonts w:ascii="Arial" w:hAnsi="Arial" w:cs="Arial"/>
-                <w:b/>
-                <w:bCs/>
-                <w:sz w:val="22"/>
-                <w:szCs w:val="22"/>
-              </w:rPr>
-            </w:pPr>
-            <w:r>
-              <w:rPr>
-                <w:rFonts w:ascii="Arial" w:hAnsi="Arial" w:cs="Arial"/>
-                <w:b/>
-                <w:bCs/>
-                <w:sz w:val="22"/>
-                <w:szCs w:val="22"/>
-              </w:rPr>
-              <w:t>${atasan_nip}</w:t>
+              <w:t xml:space="preserve">${atasan_jabatan}</w:t>
             </w:r>
           </w:p>
         </w:tc>
@@ -1058,14 +999,16 @@
               <w:rPr>
                 <w:rFonts w:ascii="Arial" w:hAnsi="Arial" w:cs="Arial"/>
                 <w:sz w:val="22"/>
-              </w:rPr>
-            </w:pPr>
-            <w:r>
-              <w:rPr>
-                <w:rFonts w:ascii="Arial" w:hAnsi="Arial" w:cs="Arial"/>
-                <w:sz w:val="22"/>
-              </w:rPr>
-              <w:t>Yang melaporkan,</w:t>
+                <w:szCs w:val="22"/>
+              </w:rPr>
+            </w:pPr>
+            <w:r>
+              <w:rPr>
+                <w:rFonts w:ascii="Arial" w:hAnsi="Arial" w:cs="Arial"/>
+                <w:sz w:val="22"/>
+                <w:szCs w:val="22"/>
+              </w:rPr>
+              <w:t xml:space="preserve">Yang melaporkan,</w:t>
             </w:r>
           </w:p>
           <w:p>
@@ -1075,39 +1018,92 @@
               <w:rPr>
                 <w:rFonts w:ascii="Arial" w:hAnsi="Arial" w:cs="Arial"/>
                 <w:sz w:val="22"/>
-              </w:rPr>
-            </w:pPr>
-            <w:r>
-              <w:rPr>
-                <w:rFonts w:ascii="Arial" w:hAnsi="Arial" w:cs="Arial"/>
-                <w:sz w:val="22"/>
-              </w:rPr>
-              <w:t>${pelapor_jabatan}</w:t>
-            </w:r>
-          </w:p>
+                <w:szCs w:val="22"/>
+              </w:rPr>
+            </w:pPr>
+            <w:r>
+              <w:rPr>
+                <w:rFonts w:ascii="Arial" w:hAnsi="Arial" w:cs="Arial"/>
+                <w:sz w:val="22"/>
+                <w:szCs w:val="22"/>
+              </w:rPr>
+              <w:t xml:space="preserve">${pelapor_jabatan}</w:t>
+            </w:r>
+          </w:p>
+        </w:tc>
+      </w:tr>
+      <w:tr>
+        <w:trPr>
+          <w:trHeight w:val="1440" w:hRule="atLeast"/>
+        </w:trPr>
+        <w:tc>
+          <w:tcPr>
+            <w:tcW w:w="4961" w:type="dxa"/>
+          </w:tcPr>
           <w:p>
             <w:pPr>
               <w:spacing w:line="360" w:lineRule="auto"/>
               <w:jc w:val="center"/>
-            </w:pPr>
-          </w:p>
+              <w:rPr>
+                <w:rFonts w:ascii="Arial" w:hAnsi="Arial" w:cs="Arial"/>
+                <w:sz w:val="22"/>
+                <w:szCs w:val="22"/>
+              </w:rPr>
+            </w:pPr>
+          </w:p>
+        </w:tc>
+        <w:tc>
+          <w:tcPr>
+            <w:tcW w:w="4962" w:type="dxa"/>
+          </w:tcPr>
           <w:p>
             <w:pPr>
               <w:spacing w:line="360" w:lineRule="auto"/>
               <w:jc w:val="center"/>
-            </w:pPr>
-          </w:p>
+              <w:rPr>
+                <w:rFonts w:ascii="Arial" w:hAnsi="Arial" w:cs="Arial"/>
+                <w:sz w:val="22"/>
+                <w:szCs w:val="22"/>
+              </w:rPr>
+            </w:pPr>
+          </w:p>
+        </w:tc>
+      </w:tr>
+      <w:tr>
+        <w:tc>
+          <w:tcPr>
+            <w:tcW w:w="4961" w:type="dxa"/>
+          </w:tcPr>
           <w:p>
             <w:pPr>
               <w:spacing w:line="360" w:lineRule="auto"/>
               <w:jc w:val="center"/>
               <w:rPr>
                 <w:rFonts w:ascii="Arial" w:hAnsi="Arial" w:cs="Arial"/>
+                <w:sz w:val="22"/>
+                <w:szCs w:val="22"/>
+              </w:rPr>
+            </w:pPr>
+            <w:r>
+              <w:rPr>
+                <w:rFonts w:ascii="Arial" w:hAnsi="Arial" w:cs="Arial"/>
                 <w:b/>
                 <w:bCs/>
                 <w:sz w:val="22"/>
                 <w:szCs w:val="22"/>
               </w:rPr>
+              <w:t xml:space="preserve">${atasan_nama}</w:t>
+            </w:r>
+          </w:p>
+          <w:p>
+            <w:pPr>
+              <w:spacing w:line="360" w:lineRule="auto"/>
+              <w:jc w:val="center"/>
+              <w:rPr>
+                <w:rFonts w:ascii="Arial" w:hAnsi="Arial" w:cs="Arial"/>
+                <w:sz w:val="22"/>
+                <w:szCs w:val="22"/>
+              </w:rPr>
             </w:pPr>
             <w:r>
               <w:rPr>
@@ -1117,20 +1113,44 @@
                 <w:sz w:val="22"/>
                 <w:szCs w:val="22"/>
               </w:rPr>
-              <w:t>${pelapor_nama}</w:t>
-            </w:r>
-          </w:p>
+              <w:t xml:space="preserve">${atasan_nip}</w:t>
+            </w:r>
+          </w:p>
+        </w:tc>
+        <w:tc>
+          <w:tcPr>
+            <w:tcW w:w="4962" w:type="dxa"/>
+          </w:tcPr>
           <w:p>
             <w:pPr>
               <w:spacing w:line="360" w:lineRule="auto"/>
               <w:jc w:val="center"/>
               <w:rPr>
                 <w:rFonts w:ascii="Arial" w:hAnsi="Arial" w:cs="Arial"/>
+                <w:sz w:val="22"/>
+                <w:szCs w:val="22"/>
+              </w:rPr>
+            </w:pPr>
+            <w:r>
+              <w:rPr>
+                <w:rFonts w:ascii="Arial" w:hAnsi="Arial" w:cs="Arial"/>
                 <w:b/>
                 <w:bCs/>
                 <w:sz w:val="22"/>
                 <w:szCs w:val="22"/>
               </w:rPr>
+              <w:t xml:space="preserve">${pelapor_nama}</w:t>
+            </w:r>
+          </w:p>
+          <w:p>
+            <w:pPr>
+              <w:spacing w:line="360" w:lineRule="auto"/>
+              <w:jc w:val="center"/>
+              <w:rPr>
+                <w:rFonts w:ascii="Arial" w:hAnsi="Arial" w:cs="Arial"/>
+                <w:sz w:val="22"/>
+                <w:szCs w:val="22"/>
+              </w:rPr>
             </w:pPr>
             <w:r>
               <w:rPr>
@@ -1140,7 +1160,7 @@
                 <w:sz w:val="22"/>
                 <w:szCs w:val="22"/>
               </w:rPr>
-              <w:t>${pelapor_nip}</w:t>
+              <w:t xml:space="preserve">${pelapor_nip}</w:t>
             </w:r>
           </w:p>
         </w:tc>

</xml_diff>